<commit_message>
Commit 3. Analisis FODA y Objetivos Gen./Especif.
en equipo hicimos un analiss foda con 5 factores externos e internos, y tambien generamos los objetivos generales y especificos
</commit_message>
<xml_diff>
--- a/Cuarta semana de Técnicas de Inteligencia Artificial.docx
+++ b/Cuarta semana de Técnicas de Inteligencia Artificial.docx
@@ -87,7 +87,25 @@
         <w:rPr>
           <w:rtl w:val="0"/>
         </w:rPr>
-        <w:br w:type="textWrapping"/>
+      </w:r>
+    </w:p>
+    <w:p>
+      <w:pPr>
+        <w:rPr/>
+      </w:pPr>
+      <w:r>
+        <w:rPr>
+          <w:b w:val="1"/>
+          <w:bCs w:val="1"/>
+          <w:rtl w:val="0"/>
+        </w:rPr>
+        <w:t xml:space="preserve">Actividad 3</w:t>
+      </w:r>
+      <w:r>
+        <w:rPr>
+          <w:rtl w:val="0"/>
+        </w:rPr>
+        <w:t xml:space="preserve">: El dia Jueves 17 de septiembre generamos un objetivo específico y general para nuestro proyecto, el cual se hacia en el cuaderno, tambien se hizo un analisis FODA tomando en cuenta 5 factores externo y 5 factores internos.</w:t>
         <w:br w:type="textWrapping"/>
       </w:r>
     </w:p>

</xml_diff>